<commit_message>
chore: se elimina el despliegue en GitHub Pages; la app se ejecuta en local
</commit_message>
<xml_diff>
--- a/docs/entrega/ExamenP2_Medidor_Anillos.docx
+++ b/docs/entrega/ExamenP2_Medidor_Anillos.docx
@@ -479,7 +479,7 @@
           <w:sz w:val="22"/>
           <w:szCs w:val="22"/>
         </w:rPr>
-        <w:t xml:space="preserve">App en línea:</w:t>
+        <w:t xml:space="preserve">Ejecución:</w:t>
       </w:r>
       <w:r>
         <w:rPr>
@@ -487,7 +487,7 @@
           <w:sz w:val="22"/>
           <w:szCs w:val="22"/>
         </w:rPr>
-        <w:t xml:space="preserve"> https://sneatx.github.io/medidor-anillos/</w:t>
+        <w:t xml:space="preserve"> local, con npm run dev.</w:t>
       </w:r>
     </w:p>
     <w:tbl>
@@ -5177,7 +5177,7 @@
                 <w:sz w:val="19"/>
                 <w:szCs w:val="19"/>
               </w:rPr>
-              <w:t xml:space="preserve">Disponibilidad</w:t>
+              <w:t xml:space="preserve">Portabilidad</w:t>
             </w:r>
           </w:p>
         </w:tc>
@@ -5208,7 +5208,7 @@
                 <w:sz w:val="19"/>
                 <w:szCs w:val="19"/>
               </w:rPr>
-              <w:t xml:space="preserve">Despliegue automático (GitHub Actions → GitHub Pages) con lint, pruebas y build</w:t>
+              <w:t xml:space="preserve">Corre en local con un solo comando (npm run dev) y no depende de servidores externos</w:t>
             </w:r>
           </w:p>
         </w:tc>
@@ -6952,7 +6952,7 @@
     <w:p>
       <w:pPr>
         <w:shd w:fill="F2F2F2" w:color="auto" w:val="clear"/>
-        <w:spacing w:after="0"/>
+        <w:spacing w:after="160"/>
       </w:pPr>
       <w:r>
         <w:rPr>
@@ -6960,21 +6960,7 @@
           <w:sz w:val="16"/>
           <w:szCs w:val="16"/>
         </w:rPr>
-        <w:t xml:space="preserve">├── docs/img/         capturas y mapas de thumb zone</w:t>
-      </w:r>
-    </w:p>
-    <w:p>
-      <w:pPr>
-        <w:shd w:fill="F2F2F2" w:color="auto" w:val="clear"/>
-        <w:spacing w:after="160"/>
-      </w:pPr>
-      <w:r>
-        <w:rPr>
-          <w:rFonts w:ascii="Consolas" w:cs="Consolas" w:eastAsia="Consolas" w:hAnsi="Consolas"/>
-          <w:sz w:val="16"/>
-          <w:szCs w:val="16"/>
-        </w:rPr>
-        <w:t xml:space="preserve">└── .github/workflows/deploy.yml   (CI/CD)</w:t>
+        <w:t xml:space="preserve">└── docs/img/         capturas y mapas de thumb zone</w:t>
       </w:r>
     </w:p>
     <w:p>
@@ -8996,7 +8982,7 @@
           <w:sz w:val="22"/>
           <w:szCs w:val="22"/>
         </w:rPr>
-        <w:t xml:space="preserve"> (comando npm test). En cada cambio subido al repositorio, GitHub Actions ejecuta el linter, las pruebas y el build.</w:t>
+        <w:t xml:space="preserve"> (comando npm test).</w:t>
       </w:r>
     </w:p>
     <w:p>
@@ -11195,7 +11181,21 @@
           <w:sz w:val="22"/>
           <w:szCs w:val="22"/>
         </w:rPr>
-        <w:t xml:space="preserve">Instalación (desarrolladores)</w:t>
+        <w:t xml:space="preserve">Cómo ejecutar la app en local</w:t>
+      </w:r>
+    </w:p>
+    <w:p>
+      <w:pPr>
+        <w:spacing w:after="120" w:line="300"/>
+        <w:jc w:val="both"/>
+      </w:pPr>
+      <w:r>
+        <w:rPr>
+          <w:rFonts w:ascii="Gadugi" w:cs="Gadugi" w:eastAsia="Gadugi" w:hAnsi="Gadugi"/>
+          <w:sz w:val="22"/>
+          <w:szCs w:val="22"/>
+        </w:rPr>
+        <w:t xml:space="preserve">Requisito: Node.js 20.19 o superior.</w:t>
       </w:r>
     </w:p>
     <w:p>
@@ -11251,7 +11251,21 @@
           <w:sz w:val="16"/>
           <w:szCs w:val="16"/>
         </w:rPr>
-        <w:t xml:space="preserve">npm run dev      # http://localhost:5173  (--host: abrir desde el celular)</w:t>
+        <w:t xml:space="preserve">npm run dev      # abre http://localhost:5173</w:t>
+      </w:r>
+    </w:p>
+    <w:p>
+      <w:pPr>
+        <w:shd w:fill="F2F2F2" w:color="auto" w:val="clear"/>
+        <w:spacing w:after="0"/>
+      </w:pPr>
+      <w:r>
+        <w:rPr>
+          <w:rFonts w:ascii="Consolas" w:cs="Consolas" w:eastAsia="Consolas" w:hAnsi="Consolas"/>
+          <w:sz w:val="16"/>
+          <w:szCs w:val="16"/>
+        </w:rPr>
+        <w:t xml:space="preserve">npm run dev -- --host   # para abrirla desde el celular (misma red Wi-Fi)</w:t>
       </w:r>
     </w:p>
     <w:p>
@@ -12059,6 +12073,18 @@
       </w:pPr>
     </w:lvl>
   </w:abstractNum>
+  <w:abstractNum w:abstractNumId="7" w15:restartNumberingAfterBreak="0">
+    <w:multiLevelType w:val="hybridMultilevel"/>
+    <w:lvl w:ilvl="0" w15:tentative="1">
+      <w:start w:val="1"/>
+      <w:numFmt w:val="decimal"/>
+      <w:lvlText w:val="%1."/>
+      <w:lvlJc w:val="left"/>
+      <w:pPr>
+        <w:ind w:left="720" w:hanging="360"/>
+      </w:pPr>
+    </w:lvl>
+  </w:abstractNum>
   <w:num w:numId="1">
     <w:abstractNumId w:val="1"/>
     <w:lvlOverride w:ilvl="0">

</xml_diff>